<commit_message>
Fill submission placeholders: demo video link, handle @yusif102, public report link
- Demo video: https://youtu.be/ed5UGcI1SXg
- Contact: @yusif102 (Telegram)
- Public report: https://docs.google.com/document/d/1yHJicXhMUojyMv1e1pPa8h5E4vGemLTIDbaOXGQS3b4/edit?usp=sharing
- Regenerated SUBMISSION.html + SUBMISSION.docx from updated DRAFT.md

Co-Authored-By: Claude <noreply@anthropic.com>
</commit_message>
<xml_diff>
--- a/b17-multihopper/findings/SUBMISSION.docx
+++ b/b17-multihopper/findings/SUBMISSION.docx
@@ -66,7 +66,7 @@
         <w:t>Contact:</w:t>
       </w:r>
       <w:r>
-        <w:t xml:space="preserve"> @&lt;YOUR_HANDLE&gt; (Telegram / Twitter)</w:t>
+        <w:t xml:space="preserve"> @yusif102 (Telegram)</w:t>
       </w:r>
     </w:p>
     <w:p>
@@ -90,7 +90,7 @@
         <w:t>Demo video:</w:t>
       </w:r>
       <w:r>
-        <w:t xml:space="preserve"> &lt;LINK_TO_DEMO_VIDEO&gt;</w:t>
+        <w:t xml:space="preserve"> https://youtu.be/ed5UGcI1SXg</w:t>
       </w:r>
     </w:p>
     <w:p>

</xml_diff>

<commit_message>
Pre-submit audit: un-gitignore evidence, coverage matrix, F12/F18/F1 fixes, Expected/Actual, idempotency
</commit_message>
<xml_diff>
--- a/b17-multihopper/findings/SUBMISSION.docx
+++ b/b17-multihopper/findings/SUBMISSION.docx
@@ -1170,6 +1170,473 @@
     </w:p>
     <w:p>
       <w:pPr>
+        <w:pStyle w:val="Heading2"/>
+      </w:pPr>
+      <w:r>
+        <w:rPr>
+          <w:color w:val="14F195"/>
+        </w:rPr>
+        <w:t>Coverage of the 8 suggested testing areas</w:t>
+      </w:r>
+    </w:p>
+    <w:p>
+      <w:r>
+        <w:t>The bounty lists 8 suggested testing areas. Our coverage:</w:t>
+      </w:r>
+    </w:p>
+    <w:tbl>
+      <w:tblPr>
+        <w:tblStyle w:val="LightGrid-Accent1"/>
+        <w:tblW w:type="auto" w:w="0"/>
+        <w:tblLook w:firstColumn="1" w:firstRow="1" w:lastColumn="0" w:lastRow="0" w:noHBand="0" w:noVBand="1" w:val="04A0"/>
+      </w:tblPr>
+      <w:tblGrid>
+        <w:gridCol w:w="2880"/>
+        <w:gridCol w:w="2880"/>
+        <w:gridCol w:w="2880"/>
+      </w:tblGrid>
+      <w:tr>
+        <w:tc>
+          <w:tcPr>
+            <w:tcW w:type="dxa" w:w="2880"/>
+          </w:tcPr>
+          <w:p>
+            <w:r/>
+            <w:r>
+              <w:t>#</w:t>
+            </w:r>
+          </w:p>
+        </w:tc>
+        <w:tc>
+          <w:tcPr>
+            <w:tcW w:type="dxa" w:w="2880"/>
+          </w:tcPr>
+          <w:p>
+            <w:r/>
+            <w:r>
+              <w:t>Suggested area</w:t>
+            </w:r>
+          </w:p>
+        </w:tc>
+        <w:tc>
+          <w:tcPr>
+            <w:tcW w:type="dxa" w:w="2880"/>
+          </w:tcPr>
+          <w:p>
+            <w:r/>
+            <w:r>
+              <w:t>Result</w:t>
+            </w:r>
+          </w:p>
+        </w:tc>
+      </w:tr>
+      <w:tr>
+        <w:tc>
+          <w:tcPr>
+            <w:tcW w:type="dxa" w:w="2880"/>
+          </w:tcPr>
+          <w:p>
+            <w:r/>
+            <w:r>
+              <w:t>1</w:t>
+            </w:r>
+          </w:p>
+        </w:tc>
+        <w:tc>
+          <w:tcPr>
+            <w:tcW w:type="dxa" w:w="2880"/>
+          </w:tcPr>
+          <w:p>
+            <w:r/>
+            <w:r>
+              <w:t>create→prepare→sign/broadcast→confirm-broadcast→monitor</w:t>
+            </w:r>
+          </w:p>
+        </w:tc>
+        <w:tc>
+          <w:tcPr>
+            <w:tcW w:type="dxa" w:w="2880"/>
+          </w:tcPr>
+          <w:p>
+            <w:r/>
+            <w:r>
+              <w:t xml:space="preserve">Harness end-to-end; </w:t>
+            </w:r>
+            <w:r>
+              <w:rPr>
+                <w:b/>
+              </w:rPr>
+              <w:t>F1</w:t>
+            </w:r>
+            <w:r>
+              <w:t xml:space="preserve"> (stuck hops), </w:t>
+            </w:r>
+            <w:r>
+              <w:rPr>
+                <w:b/>
+              </w:rPr>
+              <w:t>F18</w:t>
+            </w:r>
+            <w:r>
+              <w:t xml:space="preserve"> (never settles)</w:t>
+            </w:r>
+          </w:p>
+        </w:tc>
+      </w:tr>
+      <w:tr>
+        <w:tc>
+          <w:tcPr>
+            <w:tcW w:type="dxa" w:w="2880"/>
+          </w:tcPr>
+          <w:p>
+            <w:r/>
+            <w:r>
+              <w:t>2</w:t>
+            </w:r>
+          </w:p>
+        </w:tc>
+        <w:tc>
+          <w:tcPr>
+            <w:tcW w:type="dxa" w:w="2880"/>
+          </w:tcPr>
+          <w:p>
+            <w:r/>
+            <w:r>
+              <w:t>Client-side signing + preserve server partial sigs</w:t>
+            </w:r>
+          </w:p>
+        </w:tc>
+        <w:tc>
+          <w:tcPr>
+            <w:tcW w:type="dxa" w:w="2880"/>
+          </w:tcPr>
+          <w:p>
+            <w:r/>
+            <w:r>
+              <w:t xml:space="preserve">Harness slot-based signing correct; </w:t>
+            </w:r>
+            <w:r>
+              <w:rPr>
+                <w:b/>
+              </w:rPr>
+              <w:t>F3</w:t>
+            </w:r>
+            <w:r>
+              <w:t xml:space="preserve"> (GET signatures omit keeperFunding/orchestratorInit)</w:t>
+            </w:r>
+          </w:p>
+        </w:tc>
+      </w:tr>
+      <w:tr>
+        <w:tc>
+          <w:tcPr>
+            <w:tcW w:type="dxa" w:w="2880"/>
+          </w:tcPr>
+          <w:p>
+            <w:r/>
+            <w:r>
+              <w:t>3</w:t>
+            </w:r>
+          </w:p>
+        </w:tc>
+        <w:tc>
+          <w:tcPr>
+            <w:tcW w:type="dxa" w:w="2880"/>
+          </w:tcPr>
+          <w:p>
+            <w:r/>
+            <w:r>
+              <w:t>Strict broadcast sequencing keeper→route→orchestrator→session</w:t>
+            </w:r>
+          </w:p>
+        </w:tc>
+        <w:tc>
+          <w:tcPr>
+            <w:tcW w:type="dxa" w:w="2880"/>
+          </w:tcPr>
+          <w:p>
+            <w:r/>
+            <w:r>
+              <w:t>Implemented correctly in harness — no bug found (negative result)</w:t>
+            </w:r>
+          </w:p>
+        </w:tc>
+      </w:tr>
+      <w:tr>
+        <w:tc>
+          <w:tcPr>
+            <w:tcW w:type="dxa" w:w="2880"/>
+          </w:tcPr>
+          <w:p>
+            <w:r/>
+            <w:r>
+              <w:t>4</w:t>
+            </w:r>
+          </w:p>
+        </w:tc>
+        <w:tc>
+          <w:tcPr>
+            <w:tcW w:type="dxa" w:w="2880"/>
+          </w:tcPr>
+          <w:p>
+            <w:r/>
+            <w:r>
+              <w:t>Two-step confirm-broadcast + missing keeper funding sig</w:t>
+            </w:r>
+          </w:p>
+        </w:tc>
+        <w:tc>
+          <w:tcPr>
+            <w:tcW w:type="dxa" w:w="2880"/>
+          </w:tcPr>
+          <w:p>
+            <w:r/>
+            <w:r/>
+            <w:r>
+              <w:rPr>
+                <w:b/>
+              </w:rPr>
+              <w:t>F3</w:t>
+            </w:r>
+            <w:r>
+              <w:t xml:space="preserve"> (MH_039 context); missing Idempotency-Key → MH_070</w:t>
+            </w:r>
+          </w:p>
+        </w:tc>
+      </w:tr>
+      <w:tr>
+        <w:tc>
+          <w:tcPr>
+            <w:tcW w:type="dxa" w:w="2880"/>
+          </w:tcPr>
+          <w:p>
+            <w:r/>
+            <w:r>
+              <w:t>5</w:t>
+            </w:r>
+          </w:p>
+        </w:tc>
+        <w:tc>
+          <w:tcPr>
+            <w:tcW w:type="dxa" w:w="2880"/>
+          </w:tcPr>
+          <w:p>
+            <w:r/>
+            <w:r>
+              <w:t>Idempotency-Key, duplicate submissions, conflicting retries</w:t>
+            </w:r>
+          </w:p>
+        </w:tc>
+        <w:tc>
+          <w:tcPr>
+            <w:tcW w:type="dxa" w:w="2880"/>
+          </w:tcPr>
+          <w:p>
+            <w:r/>
+            <w:r>
+              <w:t xml:space="preserve">Tested — </w:t>
+            </w:r>
+            <w:r>
+              <w:rPr>
+                <w:b/>
+              </w:rPr>
+              <w:t>correct behavior, no bug</w:t>
+            </w:r>
+            <w:r>
+              <w:t xml:space="preserve"> (negative result): missing key → </w:t>
+            </w:r>
+            <w:r>
+              <w:rPr>
+                <w:rFonts w:ascii="Consolas" w:hAnsi="Consolas"/>
+                <w:sz w:val="19"/>
+              </w:rPr>
+              <w:t>MH_070</w:t>
+            </w:r>
+            <w:r>
+              <w:t xml:space="preserve">; same key+body twice → duplicate suppressed (same transfer id); same key+different body → </w:t>
+            </w:r>
+            <w:r>
+              <w:rPr>
+                <w:rFonts w:ascii="Consolas" w:hAnsi="Consolas"/>
+                <w:sz w:val="19"/>
+              </w:rPr>
+              <w:t>MH_071</w:t>
+            </w:r>
+            <w:r>
+              <w:t xml:space="preserve"> (409 conflict). evidence/idempotency_probe.txt</w:t>
+            </w:r>
+          </w:p>
+        </w:tc>
+      </w:tr>
+      <w:tr>
+        <w:tc>
+          <w:tcPr>
+            <w:tcW w:type="dxa" w:w="2880"/>
+          </w:tcPr>
+          <w:p>
+            <w:r/>
+            <w:r>
+              <w:t>6</w:t>
+            </w:r>
+          </w:p>
+        </w:tc>
+        <w:tc>
+          <w:tcPr>
+            <w:tcW w:type="dxa" w:w="2880"/>
+          </w:tcPr>
+          <w:p>
+            <w:r/>
+            <w:r>
+              <w:t>Expiry &amp; resume</w:t>
+            </w:r>
+          </w:p>
+        </w:tc>
+        <w:tc>
+          <w:tcPr>
+            <w:tcW w:type="dxa" w:w="2880"/>
+          </w:tcPr>
+          <w:p>
+            <w:r/>
+            <w:r>
+              <w:t xml:space="preserve">Harness resume on blockhash expiry; </w:t>
+            </w:r>
+            <w:r>
+              <w:rPr>
+                <w:b/>
+              </w:rPr>
+              <w:t>F4</w:t>
+            </w:r>
+            <w:r>
+              <w:t xml:space="preserve"> (hops/totalHops/totalSteps semantic inconsistency via </w:t>
+            </w:r>
+            <w:r>
+              <w:rPr>
+                <w:rFonts w:ascii="Consolas" w:hAnsi="Consolas"/>
+                <w:sz w:val="19"/>
+              </w:rPr>
+              <w:t>resume</w:t>
+            </w:r>
+            <w:r>
+              <w:t>)</w:t>
+            </w:r>
+          </w:p>
+        </w:tc>
+      </w:tr>
+      <w:tr>
+        <w:tc>
+          <w:tcPr>
+            <w:tcW w:type="dxa" w:w="2880"/>
+          </w:tcPr>
+          <w:p>
+            <w:r/>
+            <w:r>
+              <w:t>7</w:t>
+            </w:r>
+          </w:p>
+        </w:tc>
+        <w:tc>
+          <w:tcPr>
+            <w:tcW w:type="dxa" w:w="2880"/>
+          </w:tcPr>
+          <w:p>
+            <w:r/>
+            <w:r>
+              <w:t>Status polling, webhook monitoring, recovery paths</w:t>
+            </w:r>
+          </w:p>
+        </w:tc>
+        <w:tc>
+          <w:tcPr>
+            <w:tcW w:type="dxa" w:w="2880"/>
+          </w:tcPr>
+          <w:p>
+            <w:r/>
+            <w:r/>
+            <w:r>
+              <w:rPr>
+                <w:b/>
+              </w:rPr>
+              <w:t>F1</w:t>
+            </w:r>
+            <w:r>
+              <w:t xml:space="preserve"> (recovery false promise), </w:t>
+            </w:r>
+            <w:r>
+              <w:rPr>
+                <w:b/>
+              </w:rPr>
+              <w:t>F12–F15</w:t>
+            </w:r>
+            <w:r>
+              <w:t xml:space="preserve"> (webhook), </w:t>
+            </w:r>
+            <w:r>
+              <w:rPr>
+                <w:b/>
+              </w:rPr>
+              <w:t>F18</w:t>
+            </w:r>
+            <w:r>
+              <w:t xml:space="preserve"> (no settle)</w:t>
+            </w:r>
+          </w:p>
+        </w:tc>
+      </w:tr>
+      <w:tr>
+        <w:tc>
+          <w:tcPr>
+            <w:tcW w:type="dxa" w:w="2880"/>
+          </w:tcPr>
+          <w:p>
+            <w:r/>
+            <w:r>
+              <w:t>8</w:t>
+            </w:r>
+          </w:p>
+        </w:tc>
+        <w:tc>
+          <w:tcPr>
+            <w:tcW w:type="dxa" w:w="2880"/>
+          </w:tcPr>
+          <w:p>
+            <w:r/>
+            <w:r>
+              <w:t>Doc gaps / unsafe assumptions</w:t>
+            </w:r>
+          </w:p>
+        </w:tc>
+        <w:tc>
+          <w:tcPr>
+            <w:tcW w:type="dxa" w:w="2880"/>
+          </w:tcPr>
+          <w:p>
+            <w:r/>
+            <w:r/>
+            <w:r>
+              <w:rPr>
+                <w:b/>
+              </w:rPr>
+              <w:t>F5, F6, F8, F9, F10, F11, F14, F15, F17</w:t>
+            </w:r>
+            <w:r/>
+          </w:p>
+        </w:tc>
+      </w:tr>
+    </w:tbl>
+    <w:p>
+      <w:r/>
+      <w:r>
+        <w:rPr>
+          <w:b/>
+        </w:rPr>
+        <w:t>Severity mix:</w:t>
+      </w:r>
+      <w:r>
+        <w:t xml:space="preserve"> 1 Critical (F1), 4 High (F2, F13, F16, F18), 11 Medium, 2 Low. Of these, F5/F8/F9/F10/F11/F14/F15 are primarily documentation/integration blockers; F1/F2/F13/F16/F18 are fund-safety / security / reliability defects.</w:t>
+      </w:r>
+    </w:p>
+    <w:p>
+      <w:pPr>
         <w:jc w:val="center"/>
       </w:pPr>
       <w:r>
@@ -1688,6 +2155,70 @@
         <w:rPr>
           <w:b/>
         </w:rPr>
+        <w:t>Expected:</w:t>
+      </w:r>
+      <w:r>
+        <w:t xml:space="preserve"> </w:t>
+      </w:r>
+      <w:r>
+        <w:rPr>
+          <w:rFonts w:ascii="Consolas" w:hAnsi="Consolas"/>
+          <w:sz w:val="19"/>
+        </w:rPr>
+        <w:t>recovery.canRescue=true</w:t>
+      </w:r>
+      <w:r>
+        <w:t xml:space="preserve"> + </w:t>
+      </w:r>
+      <w:r>
+        <w:rPr>
+          <w:rFonts w:ascii="Consolas" w:hAnsi="Consolas"/>
+          <w:sz w:val="19"/>
+        </w:rPr>
+        <w:t>rescueTxs</w:t>
+      </w:r>
+      <w:r>
+        <w:t xml:space="preserve"> returned to the integrator means the integrator can sign, broadcast, and confirm a rescue that recovers the locked funds (principal + wrapper backing + rent).</w:t>
+      </w:r>
+    </w:p>
+    <w:p>
+      <w:r/>
+      <w:r>
+        <w:rPr>
+          <w:b/>
+        </w:rPr>
+        <w:t>Actual:</w:t>
+      </w:r>
+      <w:r>
+        <w:t xml:space="preserve"> The rescue tx confirms on-chain but </w:t>
+      </w:r>
+      <w:r>
+        <w:rPr>
+          <w:rFonts w:ascii="Consolas" w:hAnsi="Consolas"/>
+          <w:sz w:val="19"/>
+        </w:rPr>
+        <w:t>rescue_step</w:t>
+      </w:r>
+      <w:r>
+        <w:t xml:space="preserve"> reverts with Custom 3012; </w:t>
+      </w:r>
+      <w:r>
+        <w:rPr>
+          <w:rFonts w:ascii="Consolas" w:hAnsi="Consolas"/>
+          <w:sz w:val="19"/>
+        </w:rPr>
+        <w:t>rescue/confirm</w:t>
+      </w:r>
+      <w:r>
+        <w:t xml:space="preserve"> returns MH_083. Funds stay locked — the integrator cannot self-rescue; only MultiHopper's privileged admin key can.</w:t>
+      </w:r>
+    </w:p>
+    <w:p>
+      <w:r/>
+      <w:r>
+        <w:rPr>
+          <w:b/>
+        </w:rPr>
         <w:t>Repro (devnet, transfer 476):</w:t>
       </w:r>
       <w:r/>
@@ -1933,7 +2464,27 @@
         <w:t>2kpxgXqPi1mksZYbQgw3jdcPjhX3FbFjsAp3NcCj1yWTArbtKtS1ZT77G1evBydqhE99qxDVhqVz969GQC61ye46</w:t>
       </w:r>
       <w:r>
-        <w:t>.</w:t>
+        <w:t xml:space="preserve"> (2026-06-30); re-confirmed 2026-07-01 with sig </w:t>
+      </w:r>
+      <w:r>
+        <w:rPr>
+          <w:rFonts w:ascii="Consolas" w:hAnsi="Consolas"/>
+          <w:sz w:val="19"/>
+        </w:rPr>
+        <w:t>4ZFvagDyy1aDxC7q38RCTzcJ3ECxVDXH3wP63NzwyMeZK5r8pybBpPJje7DfzLMDQiUL3eCKA5vaSWXxvcJsDSs</w:t>
+      </w:r>
+      <w:r>
+        <w:t xml:space="preserve">. Both require </w:t>
+      </w:r>
+      <w:r>
+        <w:rPr>
+          <w:rFonts w:ascii="Consolas" w:hAnsi="Consolas"/>
+          <w:sz w:val="19"/>
+        </w:rPr>
+        <w:t>skipPreflight=true</w:t>
+      </w:r>
+      <w:r>
+        <w:t xml:space="preserve"> (the blockhash fails RPC simulation).</w:t>
       </w:r>
     </w:p>
     <w:p>
@@ -1980,7 +2531,7 @@
         <w:t>evidence/probe_476_full.txt</w:t>
       </w:r>
       <w:r>
-        <w:t xml:space="preserve">, </w:t>
+        <w:t xml:space="preserve"> (stuck state), </w:t>
       </w:r>
       <w:r>
         <w:rPr>
@@ -1990,17 +2541,67 @@
         <w:t>evidence/rescue_476.json</w:t>
       </w:r>
       <w:r>
-        <w:t xml:space="preserve">, devnet tx sigs above + rescue sig </w:t>
-      </w:r>
-      <w:r>
-        <w:rPr>
-          <w:rFonts w:ascii="Consolas" w:hAnsi="Consolas"/>
-          <w:sz w:val="19"/>
-        </w:rPr>
-        <w:t>2kpxgXqPi1mksZYbQgw3jdcPjhX3FbFjsAp3NcCj1yWTArbtKtS1ZT77G1evBydqhE99qxDVhqVz969GQC61ye46</w:t>
-      </w:r>
-      <w:r>
-        <w:t>.</w:t>
+        <w:t xml:space="preserve"> (</w:t>
+      </w:r>
+      <w:r>
+        <w:rPr>
+          <w:rFonts w:ascii="Consolas" w:hAnsi="Consolas"/>
+          <w:sz w:val="19"/>
+        </w:rPr>
+        <w:t>recovery.canRescue=true</w:t>
+      </w:r>
+      <w:r>
+        <w:t xml:space="preserve"> + </w:t>
+      </w:r>
+      <w:r>
+        <w:rPr>
+          <w:rFonts w:ascii="Consolas" w:hAnsi="Consolas"/>
+          <w:sz w:val="19"/>
+        </w:rPr>
+        <w:t>rescueTxs</w:t>
+      </w:r>
+      <w:r>
+        <w:t xml:space="preserve">), </w:t>
+      </w:r>
+      <w:r>
+        <w:rPr>
+          <w:rFonts w:ascii="Consolas" w:hAnsi="Consolas"/>
+          <w:sz w:val="19"/>
+        </w:rPr>
+        <w:t>evidence/rescue_476_execute.txt</w:t>
+      </w:r>
+      <w:r>
+        <w:t xml:space="preserve"> (full prepare→broadcast→confirm run: blockhash simulation fail → </w:t>
+      </w:r>
+      <w:r>
+        <w:rPr>
+          <w:rFonts w:ascii="Consolas" w:hAnsi="Consolas"/>
+          <w:sz w:val="19"/>
+        </w:rPr>
+        <w:t>skipPreflight</w:t>
+      </w:r>
+      <w:r>
+        <w:t xml:space="preserve"> broadcast confirmed → </w:t>
+      </w:r>
+      <w:r>
+        <w:rPr>
+          <w:rFonts w:ascii="Consolas" w:hAnsi="Consolas"/>
+          <w:sz w:val="19"/>
+        </w:rPr>
+        <w:t>MH_083</w:t>
+      </w:r>
+      <w:r>
+        <w:t xml:space="preserve"> + </w:t>
+      </w:r>
+      <w:r>
+        <w:rPr>
+          <w:rFonts w:ascii="Consolas" w:hAnsi="Consolas"/>
+          <w:sz w:val="19"/>
+        </w:rPr>
+        <w:t>Custom 3012</w:t>
+      </w:r>
+      <w:r>
+        <w:t>).</w:t>
       </w:r>
     </w:p>
     <w:p>
@@ -2515,7 +3116,7 @@
         <w:t>Evidence:</w:t>
       </w:r>
       <w:r>
-        <w:t xml:space="preserve"> first </w:t>
+        <w:t xml:space="preserve"> the first </w:t>
       </w:r>
       <w:r>
         <w:rPr>
@@ -2525,12 +3126,17 @@
         <w:t>inspect_transfer.py</w:t>
       </w:r>
       <w:r>
-        <w:t xml:space="preserve"> run captured simultaneous 500 on all</w:t>
-      </w:r>
-    </w:p>
-    <w:p>
-      <w:r>
-        <w:t xml:space="preserve">four GET endpoints with the leaked ORM/SQL query; </w:t>
+        <w:t xml:space="preserve"> run captured a simultaneous 500 on</w:t>
+      </w:r>
+    </w:p>
+    <w:p>
+      <w:r>
+        <w:t>all four GET endpoints with the leaked ORM/SQL query (quoted in full in the</w:t>
+      </w:r>
+    </w:p>
+    <w:p>
+      <w:r>
+        <w:t xml:space="preserve">Repro block above); </w:t>
       </w:r>
       <w:r>
         <w:rPr>
@@ -2539,26 +3145,28 @@
         </w:rPr>
         <w:t>evidence/probe_476_full.txt</w:t>
       </w:r>
-      <w:r/>
-    </w:p>
-    <w:p>
-      <w:r>
-        <w:t xml:space="preserve">for the recovered 200 responses; </w:t>
-      </w:r>
-      <w:r>
-        <w:rPr>
-          <w:rFonts w:ascii="Consolas" w:hAnsi="Consolas"/>
-          <w:sz w:val="19"/>
-        </w:rPr>
-        <w:t>probe_500.py</w:t>
-      </w:r>
-      <w:r>
-        <w:t xml:space="preserve"> (20× re-probe = 0/20, confirming</w:t>
-      </w:r>
-    </w:p>
-    <w:p>
-      <w:r>
-        <w:t>intermittent).</w:t>
+      <w:r>
+        <w:t xml:space="preserve"> holds the recovered 200</w:t>
+      </w:r>
+    </w:p>
+    <w:p>
+      <w:r>
+        <w:t xml:space="preserve">responses; </w:t>
+      </w:r>
+      <w:r>
+        <w:rPr>
+          <w:rFonts w:ascii="Consolas" w:hAnsi="Consolas"/>
+          <w:sz w:val="19"/>
+        </w:rPr>
+        <w:t>evidence/500_probe.txt</w:t>
+      </w:r>
+      <w:r>
+        <w:t xml:space="preserve"> (30× re-probe = 0/30) confirms the 500 is</w:t>
+      </w:r>
+    </w:p>
+    <w:p>
+      <w:r>
+        <w:t>intermittent — it appears under load, not on every request.</w:t>
       </w:r>
     </w:p>
     <w:p>
@@ -4720,6 +5328,48 @@
         <w:rPr>
           <w:b/>
         </w:rPr>
+        <w:t>Industry context:</w:t>
+      </w:r>
+      <w:r>
+        <w:t xml:space="preserve"> MCP (Model Context Protocol) is the 2026 standard for</w:t>
+      </w:r>
+    </w:p>
+    <w:p>
+      <w:r>
+        <w:t xml:space="preserve">agent↔tool integration; agent frameworks (e.g. </w:t>
+      </w:r>
+      <w:r>
+        <w:rPr>
+          <w:rFonts w:ascii="Consolas" w:hAnsi="Consolas"/>
+          <w:sz w:val="19"/>
+        </w:rPr>
+        <w:t>sendai/solana-agent-kit</w:t>
+      </w:r>
+      <w:r>
+        <w:t>)</w:t>
+      </w:r>
+    </w:p>
+    <w:p>
+      <w:r>
+        <w:t>consume MCP servers to drive protocol actions. An MCP server exposing only</w:t>
+      </w:r>
+    </w:p>
+    <w:p>
+      <w:r>
+        <w:t>docs-search — not the API-step tools the agentic guide lists — blocks the</w:t>
+      </w:r>
+    </w:p>
+    <w:p>
+      <w:r>
+        <w:t>sponsor-highlighted agentic integration path.</w:t>
+      </w:r>
+    </w:p>
+    <w:p>
+      <w:r/>
+      <w:r>
+        <w:rPr>
+          <w:b/>
+        </w:rPr>
         <w:t>Proposed fix:</w:t>
       </w:r>
       <w:r>
@@ -5273,7 +5923,7 @@
           <w:rFonts w:ascii="Consolas" w:hAnsi="Consolas"/>
           <w:sz w:val="19"/>
         </w:rPr>
-        <w:t>{"url":"https://webhook.site/&lt;uuid&gt;","events":["transfer.completed","transfer.failed","transfer.recoverable","transfer.refunded"]}</w:t>
+        <w:t>{"url":"https://webhook.site/&lt;uuid&gt;","events":["transfer.quote_created","transfer.deposit_confirmed","transfer.processing","transfer.phase_changed","transfer.hop_complete","transfer.completed","transfer.failed","transfer.recoverable","transfer.refunded","transfer.rescued","transfer.rent_reclaimed"]}</w:t>
       </w:r>
       <w:r>
         <w:t xml:space="preserve"> returns:</w:t>
@@ -5288,7 +5938,7 @@
           <w:rFonts w:ascii="Consolas" w:hAnsi="Consolas"/>
           <w:sz w:val="18"/>
         </w:rPr>
-        <w:t>{"id":133,"url":"https://webhook.site/a772b5f5-...","secret":"ae8b2675191053bca52f0a84350763b590526da4c2d2dfb7e471882c8abe55b9","events":[...],"isActive":true,"createdAt":"2026-06-30T14:30:22.854Z"}</w:t>
+        <w:t>{"id":134,"url":"https://webhook.site/a772b5f5-...","secret":"b2d9430a95fd6a36cbccc018957d8641549eb666115d9bb5d78d7d800801be95","events":["transfer.quote_created",...,"transfer.rent_reclaimed"],"isActive":true}</w:t>
       </w:r>
     </w:p>
     <w:p>
@@ -5297,6 +5947,38 @@
         <w:rPr>
           <w:b/>
         </w:rPr>
+        <w:t>Evidence:</w:t>
+      </w:r>
+      <w:r>
+        <w:t xml:space="preserve"> </w:t>
+      </w:r>
+      <w:r>
+        <w:rPr>
+          <w:rFonts w:ascii="Consolas" w:hAnsi="Consolas"/>
+          <w:sz w:val="19"/>
+        </w:rPr>
+        <w:t>evidence/webhook_registered.json</w:t>
+      </w:r>
+      <w:r>
+        <w:t xml:space="preserve"> (full 11-event response, bare-hex secret, no </w:t>
+      </w:r>
+      <w:r>
+        <w:rPr>
+          <w:rFonts w:ascii="Consolas" w:hAnsi="Consolas"/>
+          <w:sz w:val="19"/>
+        </w:rPr>
+        <w:t>whsec_</w:t>
+      </w:r>
+      <w:r>
+        <w:t xml:space="preserve"> prefix).</w:t>
+      </w:r>
+    </w:p>
+    <w:p>
+      <w:r/>
+      <w:r>
+        <w:rPr>
+          <w:b/>
+        </w:rPr>
         <w:t>Docs (`api-reference/webhooks`):</w:t>
       </w:r>
       <w:r>
@@ -5351,17 +6033,7 @@
         <w:t>whsec_</w:t>
       </w:r>
       <w:r>
-        <w:t xml:space="preserve"> prefix will also mismatch. Additionally, </w:t>
-      </w:r>
-      <w:r>
-        <w:rPr>
-          <w:rFonts w:ascii="Consolas" w:hAnsi="Consolas"/>
-          <w:sz w:val="19"/>
-        </w:rPr>
-        <w:t>isActive:true</w:t>
-      </w:r>
-      <w:r>
-        <w:t xml:space="preserve"> is returned without any URL reachability verification (the URL was a fresh, unverified webhook.site endpoint), so a mis-configured secret + unverified URL = a silently broken webhook pipeline that the integrator believes is healthy.</w:t>
+        <w:t xml:space="preserve"> prefix will also mismatch. This compounds with F13 (the verifier is broken) and F14 (wrong header name) — an integrator following the documented webhook setup + verification gets a silently broken pipeline that rejects every legitimate event.</w:t>
       </w:r>
     </w:p>
     <w:p>
@@ -5383,27 +6055,7 @@
         <w:t>whsec_</w:t>
       </w:r>
       <w:r>
-        <w:t xml:space="preserve"> as documented, or update the docs to state the secret is bare hex. Verify webhook URL reachability before setting </w:t>
-      </w:r>
-      <w:r>
-        <w:rPr>
-          <w:rFonts w:ascii="Consolas" w:hAnsi="Consolas"/>
-          <w:sz w:val="19"/>
-        </w:rPr>
-        <w:t>isActive:true</w:t>
-      </w:r>
-      <w:r>
-        <w:t xml:space="preserve"> (emit </w:t>
-      </w:r>
-      <w:r>
-        <w:rPr>
-          <w:rFonts w:ascii="Consolas" w:hAnsi="Consolas"/>
-          <w:sz w:val="19"/>
-        </w:rPr>
-        <w:t>MH_050</w:t>
-      </w:r>
-      <w:r>
-        <w:t xml:space="preserve"> for unreachable URLs).</w:t>
+        <w:t xml:space="preserve"> as documented, or update the docs to state the secret is bare hex.</w:t>
       </w:r>
     </w:p>
     <w:p>
@@ -5441,10 +6093,10 @@
         <w:rPr>
           <w:b/>
         </w:rPr>
-        <w:t>Repro (devnet, real webhook delivery to webhook.site for transfer 479):</w:t>
-      </w:r>
-      <w:r>
-        <w:t xml:space="preserve"> MultiHopper delivered 4 signed events (</w:t>
+        <w:t>Repro (devnet, real webhook delivery to webhook.site):</w:t>
+      </w:r>
+      <w:r>
+        <w:t xml:space="preserve"> MultiHopper delivered 14 signed events (</w:t>
       </w:r>
       <w:r>
         <w:rPr>
@@ -5464,7 +6116,7 @@
         <w:t>phase_changed</w:t>
       </w:r>
       <w:r>
-        <w:t xml:space="preserve"> ×2, </w:t>
+        <w:t xml:space="preserve">, </w:t>
       </w:r>
       <w:r>
         <w:rPr>
@@ -5474,7 +6126,17 @@
         <w:t>processing</w:t>
       </w:r>
       <w:r>
-        <w:t xml:space="preserve">), each with header </w:t>
+        <w:t xml:space="preserve">, </w:t>
+      </w:r>
+      <w:r>
+        <w:rPr>
+          <w:rFonts w:ascii="Consolas" w:hAnsi="Consolas"/>
+          <w:sz w:val="19"/>
+        </w:rPr>
+        <w:t>hop_complete</w:t>
+      </w:r>
+      <w:r>
+        <w:t xml:space="preserve"> ×8, …) for transfers 478/479/480–483, each with header </w:t>
       </w:r>
       <w:r>
         <w:rPr>
@@ -5520,7 +6182,7 @@
         <w:t>x-mh-signature</w:t>
       </w:r>
       <w:r>
-        <w:t xml:space="preserve"> for all 4 events.</w:t>
+        <w:t xml:space="preserve"> for all 14 events.</w:t>
       </w:r>
     </w:p>
     <w:p>
@@ -5556,7 +6218,7 @@
         <w:t>mismatches</w:t>
       </w:r>
       <w:r>
-        <w:t xml:space="preserve"> for </w:t>
+        <w:t xml:space="preserve"> for 12/14 events (any body with &gt;3 keys: </w:t>
       </w:r>
       <w:r>
         <w:rPr>
@@ -5566,7 +6228,7 @@
         <w:t>quote_created</w:t>
       </w:r>
       <w:r>
-        <w:t xml:space="preserve"> and </w:t>
+        <w:t xml:space="preserve">, </w:t>
       </w:r>
       <w:r>
         <w:rPr>
@@ -5576,7 +6238,17 @@
         <w:t>processing</w:t>
       </w:r>
       <w:r>
-        <w:t xml:space="preserve"> (key order/content differs); matches only for the trivial </w:t>
+        <w:t xml:space="preserve">, </w:t>
+      </w:r>
+      <w:r>
+        <w:rPr>
+          <w:rFonts w:ascii="Consolas" w:hAnsi="Consolas"/>
+          <w:sz w:val="19"/>
+        </w:rPr>
+        <w:t>hop_complete</w:t>
+      </w:r>
+      <w:r>
+        <w:t xml:space="preserve">); matches only for the trivial 3-key </w:t>
       </w:r>
       <w:r>
         <w:rPr>
@@ -5586,7 +6258,7 @@
         <w:t>phase_changed</w:t>
       </w:r>
       <w:r>
-        <w:t xml:space="preserve"> body.</w:t>
+        <w:t xml:space="preserve"> bodies.</w:t>
       </w:r>
     </w:p>
     <w:p>
@@ -5797,10 +6469,20 @@
           <w:rFonts w:ascii="Consolas" w:hAnsi="Consolas"/>
           <w:sz w:val="19"/>
         </w:rPr>
+        <w:t>evidence/hmac_verification.txt</w:t>
+      </w:r>
+      <w:r>
+        <w:t xml:space="preserve"> (14 events: HMAC raw = match 14/14, HMAC canonical = mismatch 12/14) + </w:t>
+      </w:r>
+      <w:r>
+        <w:rPr>
+          <w:rFonts w:ascii="Consolas" w:hAnsi="Consolas"/>
+          <w:sz w:val="19"/>
+        </w:rPr>
         <w:t>evidence/webhook_events.json</w:t>
       </w:r>
       <w:r>
-        <w:t xml:space="preserve"> (4 events with bodies + signatures).</w:t>
+        <w:t>.</w:t>
       </w:r>
     </w:p>
     <w:p>
@@ -5813,6 +6495,46 @@
       </w:r>
       <w:r>
         <w:t xml:space="preserve"> An agent that copy-pastes the documented verifier either rejects every webhook (availability) or crashes on malformed signatures (DoS). The event-driven recovery path (see F1) is broken for the integrator.</w:t>
+      </w:r>
+    </w:p>
+    <w:p>
+      <w:r/>
+      <w:r>
+        <w:rPr>
+          <w:b/>
+        </w:rPr>
+        <w:t>Industry context:</w:t>
+      </w:r>
+      <w:r>
+        <w:t xml:space="preserve"> Standard webhook practice (Stripe, Svix, webhooks.fyi) signs the </w:t>
+      </w:r>
+      <w:r>
+        <w:rPr>
+          <w:b/>
+        </w:rPr>
+        <w:t>raw request body</w:t>
+      </w:r>
+      <w:r>
+        <w:t xml:space="preserve"> and verifies the HMAC </w:t>
+      </w:r>
+      <w:r>
+        <w:rPr>
+          <w:b/>
+        </w:rPr>
+        <w:t>before</w:t>
+      </w:r>
+      <w:r>
+        <w:t xml:space="preserve"> JSON parsing. The documented MultiHopper verifier inverts both — it verifies parsed JSON and omits the length guard that prevents </w:t>
+      </w:r>
+      <w:r>
+        <w:rPr>
+          <w:rFonts w:ascii="Consolas" w:hAnsi="Consolas"/>
+          <w:sz w:val="19"/>
+        </w:rPr>
+        <w:t>timingSafeEqual</w:t>
+      </w:r>
+      <w:r>
+        <w:t xml:space="preserve"> from throwing.</w:t>
       </w:r>
     </w:p>
     <w:p>
@@ -6962,6 +7684,130 @@
         <w:rPr>
           <w:b/>
         </w:rPr>
+        <w:t>Expected:</w:t>
+      </w:r>
+      <w:r>
+        <w:t xml:space="preserve"> After all hops execute (</w:t>
+      </w:r>
+      <w:r>
+        <w:rPr>
+          <w:rFonts w:ascii="Consolas" w:hAnsi="Consolas"/>
+          <w:sz w:val="19"/>
+        </w:rPr>
+        <w:t>hopsCompleted=N/N</w:t>
+      </w:r>
+      <w:r>
+        <w:t xml:space="preserve">), the transfer reaches </w:t>
+      </w:r>
+      <w:r>
+        <w:rPr>
+          <w:rFonts w:ascii="Consolas" w:hAnsi="Consolas"/>
+          <w:sz w:val="19"/>
+        </w:rPr>
+        <w:t>status=completed</w:t>
+      </w:r>
+      <w:r>
+        <w:t xml:space="preserve"> / </w:t>
+      </w:r>
+      <w:r>
+        <w:rPr>
+          <w:rFonts w:ascii="Consolas" w:hAnsi="Consolas"/>
+          <w:sz w:val="19"/>
+        </w:rPr>
+        <w:t>phase=settled</w:t>
+      </w:r>
+      <w:r>
+        <w:t xml:space="preserve"> via the documented API flow, with </w:t>
+      </w:r>
+      <w:r>
+        <w:rPr>
+          <w:rFonts w:ascii="Consolas" w:hAnsi="Consolas"/>
+          <w:sz w:val="19"/>
+        </w:rPr>
+        <w:t>completedAt</w:t>
+      </w:r>
+      <w:r>
+        <w:t xml:space="preserve"> set and the recipient receiving funds.</w:t>
+      </w:r>
+    </w:p>
+    <w:p>
+      <w:r/>
+      <w:r>
+        <w:rPr>
+          <w:b/>
+        </w:rPr>
+        <w:t>Actual:</w:t>
+      </w:r>
+      <w:r>
+        <w:t xml:space="preserve"> </w:t>
+      </w:r>
+      <w:r>
+        <w:rPr>
+          <w:rFonts w:ascii="Consolas" w:hAnsi="Consolas"/>
+          <w:sz w:val="19"/>
+        </w:rPr>
+        <w:t>hopsCompleted=4/4</w:t>
+      </w:r>
+      <w:r>
+        <w:t xml:space="preserve"> but </w:t>
+      </w:r>
+      <w:r>
+        <w:rPr>
+          <w:rFonts w:ascii="Consolas" w:hAnsi="Consolas"/>
+          <w:sz w:val="19"/>
+        </w:rPr>
+        <w:t>status=active, phase=executing, completedAt=null, recovery={canRescue:false}</w:t>
+      </w:r>
+      <w:r>
+        <w:t xml:space="preserve"> indefinitely — no terminal state, no rescuable funds. The </w:t>
+      </w:r>
+      <w:r>
+        <w:rPr>
+          <w:rFonts w:ascii="Consolas" w:hAnsi="Consolas"/>
+          <w:sz w:val="19"/>
+        </w:rPr>
+        <w:t>unwrap</w:t>
+      </w:r>
+      <w:r>
+        <w:t>/</w:t>
+      </w:r>
+      <w:r>
+        <w:rPr>
+          <w:rFonts w:ascii="Consolas" w:hAnsi="Consolas"/>
+          <w:sz w:val="19"/>
+        </w:rPr>
+        <w:t>unwrap_sol</w:t>
+      </w:r>
+      <w:r>
+        <w:t xml:space="preserve"> step from </w:t>
+      </w:r>
+      <w:r>
+        <w:rPr>
+          <w:rFonts w:ascii="Consolas" w:hAnsi="Consolas"/>
+          <w:sz w:val="19"/>
+        </w:rPr>
+        <w:t>route-lifecycle</w:t>
+      </w:r>
+      <w:r>
+        <w:t xml:space="preserve"> is not exposed through the API; an agent polling for </w:t>
+      </w:r>
+      <w:r>
+        <w:rPr>
+          <w:rFonts w:ascii="Consolas" w:hAnsi="Consolas"/>
+          <w:sz w:val="19"/>
+        </w:rPr>
+        <w:t>completed</w:t>
+      </w:r>
+      <w:r>
+        <w:t xml:space="preserve"> waits forever; principal stays locked in the vault (wrapper tokens minted, never burned).</w:t>
+      </w:r>
+    </w:p>
+    <w:p>
+      <w:r/>
+      <w:r>
+        <w:rPr>
+          <w:b/>
+        </w:rPr>
         <w:t>Repro (devnet, transfer 479):</w:t>
       </w:r>
       <w:r>
@@ -7002,10 +7848,10 @@
           <w:rFonts w:ascii="Consolas" w:hAnsi="Consolas"/>
           <w:sz w:val="19"/>
         </w:rPr>
-        <w:t>status=active, phase=executing, completedAt=null, lastError=null, recovery=null</w:t>
-      </w:r>
-      <w:r>
-        <w:t xml:space="preserve"> indefinitely. No terminal state is reached. (</w:t>
+        <w:t>status=active, phase=executing, completedAt=null, lastError=null, recovery={canRescue:false}</w:t>
+      </w:r>
+      <w:r>
+        <w:t xml:space="preserve"> indefinitely — no terminal state, no rescuable funds. </w:t>
       </w:r>
       <w:r>
         <w:rPr>
@@ -7015,17 +7861,86 @@
         <w:t>expiresAt</w:t>
       </w:r>
       <w:r>
-        <w:t xml:space="preserve"> has passed; </w:t>
-      </w:r>
-      <w:r>
-        <w:rPr>
-          <w:rFonts w:ascii="Consolas" w:hAnsi="Consolas"/>
-          <w:sz w:val="19"/>
-        </w:rPr>
-        <w:t>recovery</w:t>
-      </w:r>
-      <w:r>
-        <w:t xml:space="preserve"> still null.)</w:t>
+        <w:t xml:space="preserve"> has passed. </w:t>
+      </w:r>
+      <w:r>
+        <w:rPr>
+          <w:b/>
+        </w:rPr>
+        <w:t>Evidence:</w:t>
+      </w:r>
+      <w:r>
+        <w:t xml:space="preserve"> </w:t>
+      </w:r>
+      <w:r>
+        <w:rPr>
+          <w:rFonts w:ascii="Consolas" w:hAnsi="Consolas"/>
+          <w:sz w:val="19"/>
+        </w:rPr>
+        <w:t>evidence/transfer_479_full.txt</w:t>
+      </w:r>
+      <w:r>
+        <w:t>. Transfer 478 shows the same pattern (</w:t>
+      </w:r>
+      <w:r>
+        <w:rPr>
+          <w:rFonts w:ascii="Consolas" w:hAnsi="Consolas"/>
+          <w:sz w:val="19"/>
+        </w:rPr>
+        <w:t>hopsCompleted=4/4</w:t>
+      </w:r>
+      <w:r>
+        <w:t xml:space="preserve">, </w:t>
+      </w:r>
+      <w:r>
+        <w:rPr>
+          <w:rFonts w:ascii="Consolas" w:hAnsi="Consolas"/>
+          <w:sz w:val="19"/>
+        </w:rPr>
+        <w:t>status=active</w:t>
+      </w:r>
+      <w:r>
+        <w:t xml:space="preserve">, </w:t>
+      </w:r>
+      <w:r>
+        <w:rPr>
+          <w:rFonts w:ascii="Consolas" w:hAnsi="Consolas"/>
+          <w:sz w:val="19"/>
+        </w:rPr>
+        <w:t>phase=executing</w:t>
+      </w:r>
+      <w:r>
+        <w:t xml:space="preserve">). </w:t>
+      </w:r>
+      <w:r>
+        <w:rPr>
+          <w:rFonts w:ascii="Consolas" w:hAnsi="Consolas"/>
+          <w:sz w:val="19"/>
+        </w:rPr>
+        <w:t>GET /usage</w:t>
+      </w:r>
+      <w:r>
+        <w:t xml:space="preserve"> reports </w:t>
+      </w:r>
+      <w:r>
+        <w:rPr>
+          <w:rFonts w:ascii="Consolas" w:hAnsi="Consolas"/>
+          <w:sz w:val="19"/>
+        </w:rPr>
+        <w:t>totalTransfers=9, completedTransfers=0</w:t>
+      </w:r>
+      <w:r>
+        <w:t xml:space="preserve"> — no transfer in this test account has ever reached </w:t>
+      </w:r>
+      <w:r>
+        <w:rPr>
+          <w:rFonts w:ascii="Consolas" w:hAnsi="Consolas"/>
+          <w:sz w:val="19"/>
+        </w:rPr>
+        <w:t>completed</w:t>
+      </w:r>
+      <w:r>
+        <w:t>.</w:t>
       </w:r>
     </w:p>
     <w:p>
@@ -7198,6 +8113,122 @@
       </w:pPr>
       <w:r>
         <w:t>—</w:t>
+      </w:r>
+    </w:p>
+    <w:p>
+      <w:pPr>
+        <w:pStyle w:val="Heading2"/>
+      </w:pPr>
+      <w:r>
+        <w:rPr>
+          <w:color w:val="14F195"/>
+        </w:rPr>
+        <w:t>Areas tested — no issue found (negative results)</w:t>
+      </w:r>
+    </w:p>
+    <w:p>
+      <w:r>
+        <w:t>To document coverage and responsible testing, we explicitly probed the following and found correct behavior — these are not findings, but confirm the areas were exercised:</w:t>
+      </w:r>
+    </w:p>
+    <w:p>
+      <w:pPr>
+        <w:pStyle w:val="ListBullet"/>
+      </w:pPr>
+      <w:r/>
+      <w:r>
+        <w:rPr>
+          <w:b/>
+        </w:rPr>
+        <w:t>Idempotency-Key (suggested area #5):</w:t>
+      </w:r>
+      <w:r>
+        <w:t xml:space="preserve"> missing key → </w:t>
+      </w:r>
+      <w:r>
+        <w:rPr>
+          <w:rFonts w:ascii="Consolas" w:hAnsi="Consolas"/>
+          <w:sz w:val="19"/>
+        </w:rPr>
+        <w:t>MH_070</w:t>
+      </w:r>
+      <w:r>
+        <w:t xml:space="preserve"> (400); same </w:t>
+      </w:r>
+      <w:r>
+        <w:rPr>
+          <w:rFonts w:ascii="Consolas" w:hAnsi="Consolas"/>
+          <w:sz w:val="19"/>
+        </w:rPr>
+        <w:t>Idempotency-Key</w:t>
+      </w:r>
+      <w:r>
+        <w:t xml:space="preserve"> + same body twice → duplicate suppressed (returns the same transfer </w:t>
+      </w:r>
+      <w:r>
+        <w:rPr>
+          <w:rFonts w:ascii="Consolas" w:hAnsi="Consolas"/>
+          <w:sz w:val="19"/>
+        </w:rPr>
+        <w:t>id</w:t>
+      </w:r>
+      <w:r>
+        <w:t xml:space="preserve">, no second transfer created); same </w:t>
+      </w:r>
+      <w:r>
+        <w:rPr>
+          <w:rFonts w:ascii="Consolas" w:hAnsi="Consolas"/>
+          <w:sz w:val="19"/>
+        </w:rPr>
+        <w:t>Idempotency-Key</w:t>
+      </w:r>
+      <w:r>
+        <w:t xml:space="preserve"> + different body → </w:t>
+      </w:r>
+      <w:r>
+        <w:rPr>
+          <w:rFonts w:ascii="Consolas" w:hAnsi="Consolas"/>
+          <w:sz w:val="19"/>
+        </w:rPr>
+        <w:t>MH_071</w:t>
+      </w:r>
+      <w:r>
+        <w:t xml:space="preserve"> (409 "Idempotency-Key reused with a different request body"). Idempotency works as expected. Evidence: </w:t>
+      </w:r>
+      <w:r>
+        <w:rPr>
+          <w:rFonts w:ascii="Consolas" w:hAnsi="Consolas"/>
+          <w:sz w:val="19"/>
+        </w:rPr>
+        <w:t>evidence/idempotency_probe.txt</w:t>
+      </w:r>
+      <w:r>
+        <w:t>.</w:t>
+      </w:r>
+    </w:p>
+    <w:p>
+      <w:pPr>
+        <w:pStyle w:val="ListBullet"/>
+      </w:pPr>
+      <w:r/>
+      <w:r>
+        <w:rPr>
+          <w:b/>
+        </w:rPr>
+        <w:t>Strict broadcast sequencing (suggested area #3):</w:t>
+      </w:r>
+      <w:r>
+        <w:t xml:space="preserve"> the harness broadcasts </w:t>
+      </w:r>
+      <w:r>
+        <w:rPr>
+          <w:rFonts w:ascii="Consolas" w:hAnsi="Consolas"/>
+          <w:sz w:val="19"/>
+        </w:rPr>
+        <w:t>keeperFundingTx → routeInitTxs[] → orchestratorInitTx → sessionInitTxs[]</w:t>
+      </w:r>
+      <w:r>
+        <w:t xml:space="preserve"> in order with confirmation polling and 3s propagation delays; all 5 txs confirmed on devnet. No sequencing bug found.</w:t>
       </w:r>
     </w:p>
     <w:p>

</xml_diff>